<commit_message>
docs(zamowienia): errata audytu — P1 to zamierzone zabezpieczenie, nie bug
Dokument audytu (#1376) w §8.C zgłaszał P1 (enforce_consultant_policy_safety
czyści stawkę po no-matchu) jako „realny bug / niepokryte testami". To błąd:
zachowanie jest ZAMIERZONE i POKRYTE testem
test_target_policy_safety_stays_fail_closed_after_no_match (bank_pocztowy +
credit_agricole) — dokument może dotyczyć INNEJ osoby niż wybrany kandydat, więc
zastosowanie jego stawki byłoby błędem. Próba fixu (PR #1392, zamknięty) to
potwierdziła. Realny, węższy problem (false-negative matchera na wariancie nazwy
tej samej osoby) należy naprawić w dopasowaniu nazwisk, nie przez obejście enforce.

Przy okazji: bullet „alerty pulpitu bez DL" oznaczony jako naprawiony (PR #1394,
backstop). Metryka: nota errata 2026-09-08. Diagram i tabele bez zmian.

Co-Authored-By: Claude Opus 4.8 <noreply@anthropic.com>
</commit_message>
<xml_diff>
--- a/docs/audyt-przeplyw-zamowien-i-kontraktow-2026-09.docx
+++ b/docs/audyt-przeplyw-zamowien-i-kontraktow-2026-09.docx
@@ -31,7 +31,7 @@
           <w:color w:val="64748B"/>
           <w:sz w:val="20"/>
         </w:rPr>
-        <w:t>NEXUS (ATS) · stan kodu na 2026-09-07 · audyt na podstawie kodu produkcyjnego</w:t>
+        <w:t>NEXUS (ATS) · stan kodu na 2026-09-07 · audyt na podstawie kodu produkcyjnego · errata §8.C (P1) z 2026-09-08</w:t>
       </w:r>
     </w:p>
     <w:p>
@@ -4385,10 +4385,10 @@
         <w:rPr>
           <w:b/>
         </w:rPr>
-        <w:t xml:space="preserve">[P1] enforce_consultant_policy_safety czyści deterministyczną stawkę. </w:t>
+        <w:t xml:space="preserve">[SKORYGOWANE 2026-09-08] enforce_consultant_policy_safety czyści stawkę po no-matchu — to ZAMIERZONE zabezpieczenie, nie bug. </w:t>
       </w:r>
       <w:r>
-        <w:t>Dla 7 polityk (bank_pocztowy, pko_bp, kir, mleasing, velobank, alior, cardif) gdy LLM-matcher nie potwierdził wiersza osoby — czyli dokładnie w sytuacji, dla której deterministyczny parser istnieje. Niepokryte testami.</w:t>
+        <w:t>Pierwotny audyt zgłaszał to jako P1 („deterministyczny parser istnieje właśnie dla tej sytuacji, więc enforce niesłusznie kasuje stawkę”) i błędnie jako „niepokryte testami”. Weryfikacja przy próbie fixu (PR zamknięty) pokazała, że jest odwrotnie: dokument może dotyczyć INNEJ osoby niż wybrany kandydat, a wtedy zastosowanie jego stawki byłoby błędem. Pokrywa to istniejący test test_target_policy_safety_stays_fail_closed_after_no_match (bank_pocztowy + credit_agricole). Realny, węższy problem — poprawna stawka czyszczona przy false-negative matchera na WARIANCIE nazwy TEJ SAMEJ osoby — należy naprawić w dopasowaniu nazwisk matchera, nie przez obejście enforce. To osobna, ostrożna zmiana.</w:t>
       </w:r>
     </w:p>
     <w:p>
@@ -4441,10 +4441,10 @@
         <w:rPr>
           <w:b/>
         </w:rPr>
-        <w:t xml:space="preserve">Klient bez przypisanego DL → alerty PULPITU przepadają. </w:t>
+        <w:t xml:space="preserve">Klient bez przypisanego DL → alerty PULPITU przepadają (naprawione — PR #1394). </w:t>
       </w:r>
       <w:r>
-        <w:t>Emisja idzie do pustej listy; cost_order_exhausted / wspólna pula bez reconcile → utrata bezpowrotna. Brak fallbacku na admina.</w:t>
+        <w:t>Emisja idzie do pustej listy; cost_order_exhausted / wspólna pula bez reconcile → utrata bezpowrotna. Backstop reconcile_exhausted_group_budget_alerts dostarcza alert po przypisaniu DL (zamiast zmiany routingu na admina — decyzja produktowa).</w:t>
       </w:r>
     </w:p>
     <w:p>

</xml_diff>

<commit_message>
docs(zamowienia): errata audytu — P1 to zamierzone zabezpieczenie, nie bug (#1404)
Dokument audytu (#1376) w §8.C zgłaszał P1 (enforce_consultant_policy_safety
czyści stawkę po no-matchu) jako „realny bug / niepokryte testami". To błąd:
zachowanie jest ZAMIERZONE i POKRYTE testem
test_target_policy_safety_stays_fail_closed_after_no_match (bank_pocztowy +
credit_agricole) — dokument może dotyczyć INNEJ osoby niż wybrany kandydat, więc
zastosowanie jego stawki byłoby błędem. Próba fixu (PR #1392, zamknięty) to
potwierdziła. Realny, węższy problem (false-negative matchera na wariancie nazwy
tej samej osoby) należy naprawić w dopasowaniu nazwisk, nie przez obejście enforce.

Przy okazji: bullet „alerty pulpitu bez DL" oznaczony jako naprawiony (PR #1394,
backstop). Metryka: nota errata 2026-09-08. Diagram i tabele bez zmian.

Co-authored-by: dynaminds-codex-bot[bot] <305396966+dynaminds-codex-bot[bot]@users.noreply.github.com>
Co-authored-by: Claude Opus 4.8 <noreply@anthropic.com>
</commit_message>
<xml_diff>
--- a/docs/audyt-przeplyw-zamowien-i-kontraktow-2026-09.docx
+++ b/docs/audyt-przeplyw-zamowien-i-kontraktow-2026-09.docx
@@ -31,7 +31,7 @@
           <w:color w:val="64748B"/>
           <w:sz w:val="20"/>
         </w:rPr>
-        <w:t>NEXUS (ATS) · stan kodu na 2026-09-07 · audyt na podstawie kodu produkcyjnego</w:t>
+        <w:t>NEXUS (ATS) · stan kodu na 2026-09-07 · audyt na podstawie kodu produkcyjnego · errata §8.C (P1) z 2026-09-08</w:t>
       </w:r>
     </w:p>
     <w:p>
@@ -4385,10 +4385,10 @@
         <w:rPr>
           <w:b/>
         </w:rPr>
-        <w:t xml:space="preserve">[P1] enforce_consultant_policy_safety czyści deterministyczną stawkę. </w:t>
+        <w:t xml:space="preserve">[SKORYGOWANE 2026-09-08] enforce_consultant_policy_safety czyści stawkę po no-matchu — to ZAMIERZONE zabezpieczenie, nie bug. </w:t>
       </w:r>
       <w:r>
-        <w:t>Dla 7 polityk (bank_pocztowy, pko_bp, kir, mleasing, velobank, alior, cardif) gdy LLM-matcher nie potwierdził wiersza osoby — czyli dokładnie w sytuacji, dla której deterministyczny parser istnieje. Niepokryte testami.</w:t>
+        <w:t>Pierwotny audyt zgłaszał to jako P1 („deterministyczny parser istnieje właśnie dla tej sytuacji, więc enforce niesłusznie kasuje stawkę”) i błędnie jako „niepokryte testami”. Weryfikacja przy próbie fixu (PR zamknięty) pokazała, że jest odwrotnie: dokument może dotyczyć INNEJ osoby niż wybrany kandydat, a wtedy zastosowanie jego stawki byłoby błędem. Pokrywa to istniejący test test_target_policy_safety_stays_fail_closed_after_no_match (bank_pocztowy + credit_agricole). Realny, węższy problem — poprawna stawka czyszczona przy false-negative matchera na WARIANCIE nazwy TEJ SAMEJ osoby — należy naprawić w dopasowaniu nazwisk matchera, nie przez obejście enforce. To osobna, ostrożna zmiana.</w:t>
       </w:r>
     </w:p>
     <w:p>
@@ -4441,10 +4441,10 @@
         <w:rPr>
           <w:b/>
         </w:rPr>
-        <w:t xml:space="preserve">Klient bez przypisanego DL → alerty PULPITU przepadają. </w:t>
+        <w:t xml:space="preserve">Klient bez przypisanego DL → alerty PULPITU przepadają (naprawione — PR #1394). </w:t>
       </w:r>
       <w:r>
-        <w:t>Emisja idzie do pustej listy; cost_order_exhausted / wspólna pula bez reconcile → utrata bezpowrotna. Brak fallbacku na admina.</w:t>
+        <w:t>Emisja idzie do pustej listy; cost_order_exhausted / wspólna pula bez reconcile → utrata bezpowrotna. Backstop reconcile_exhausted_group_budget_alerts dostarcza alert po przypisaniu DL (zamiast zmiany routingu na admina — decyzja produktowa).</w:t>
       </w:r>
     </w:p>
     <w:p>

</xml_diff>